<commit_message>
PC -> lap: Interaccion
</commit_message>
<xml_diff>
--- a/TAREAS 6 SEMESTRE/QuijasContrerasVictorManuel21082026TC#2.docx
+++ b/TAREAS 6 SEMESTRE/QuijasContrerasVictorManuel21082026TC#2.docx
@@ -1105,7 +1105,23 @@
                                 <w:sz w:val="44"/>
                                 <w:szCs w:val="48"/>
                               </w:rPr>
-                              <w:t>Jovan Ricardo Zepeda Gómez</w:t>
+                              <w:t>Jovan Ricar</w:t>
+                            </w:r>
+                            <w:r>
+                              <w:rPr>
+                                <w:rFonts w:asciiTheme="majorHAnsi" w:hAnsiTheme="majorHAnsi" w:cstheme="majorHAnsi"/>
+                                <w:sz w:val="44"/>
+                                <w:szCs w:val="48"/>
+                              </w:rPr>
+                              <w:t>a</w:t>
+                            </w:r>
+                            <w:r>
+                              <w:rPr>
+                                <w:rFonts w:asciiTheme="majorHAnsi" w:hAnsiTheme="majorHAnsi" w:cstheme="majorHAnsi"/>
+                                <w:sz w:val="44"/>
+                                <w:szCs w:val="48"/>
+                              </w:rPr>
+                              <w:t>do Zepeda Gómez</w:t>
                             </w:r>
                             <w:r>
                               <w:rPr>
@@ -1190,7 +1206,11 @@
           </mc:Choice>
           <mc:Fallback>
             <w:pict>
-              <v:shape w14:anchorId="4382B185" id="Cuadro de texto 283" o:spid="_x0000_s1029" type="#_x0000_t202" style="position:absolute;left:0;text-align:left;margin-left:70.15pt;margin-top:36.3pt;width:439.35pt;height:183.5pt;z-index:251655168;visibility:visible;mso-wrap-style:square;mso-width-percent:0;mso-height-percent:0;mso-wrap-distance-left:9pt;mso-wrap-distance-top:0;mso-wrap-distance-right:9pt;mso-wrap-distance-bottom:0;mso-position-horizontal:absolute;mso-position-horizontal-relative:page;mso-position-vertical:absolute;mso-position-vertical-relative:text;mso-width-percent:0;mso-height-percent:0;mso-width-relative:margin;mso-height-relative:margin;v-text-anchor:top" o:gfxdata="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" filled="f" strokecolor="#81685d [1614]" strokeweight="3pt">
+              <v:shapetype w14:anchorId="4382B185" id="_x0000_t202" coordsize="21600,21600" o:spt="202" path="m,l,21600r21600,l21600,xe">
+                <v:stroke joinstyle="miter"/>
+                <v:path gradientshapeok="t" o:connecttype="rect"/>
+              </v:shapetype>
+              <v:shape id="Cuadro de texto 283" o:spid="_x0000_s1029" type="#_x0000_t202" style="position:absolute;left:0;text-align:left;margin-left:70.15pt;margin-top:36.3pt;width:439.35pt;height:183.5pt;z-index:251655168;visibility:visible;mso-wrap-style:square;mso-width-percent:0;mso-height-percent:0;mso-wrap-distance-left:9pt;mso-wrap-distance-top:0;mso-wrap-distance-right:9pt;mso-wrap-distance-bottom:0;mso-position-horizontal:absolute;mso-position-horizontal-relative:page;mso-position-vertical:absolute;mso-position-vertical-relative:text;mso-width-percent:0;mso-height-percent:0;mso-width-relative:margin;mso-height-relative:margin;v-text-anchor:top" o:gfxdata="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" filled="f" strokecolor="#81685d [1614]" strokeweight="3pt">
                 <v:stroke dashstyle="longDashDotDot"/>
                 <v:textbox>
                   <w:txbxContent>
@@ -1307,7 +1327,23 @@
                           <w:sz w:val="44"/>
                           <w:szCs w:val="48"/>
                         </w:rPr>
-                        <w:t>Jovan Ricardo Zepeda Gómez</w:t>
+                        <w:t>Jovan Ricar</w:t>
+                      </w:r>
+                      <w:r>
+                        <w:rPr>
+                          <w:rFonts w:asciiTheme="majorHAnsi" w:hAnsiTheme="majorHAnsi" w:cstheme="majorHAnsi"/>
+                          <w:sz w:val="44"/>
+                          <w:szCs w:val="48"/>
+                        </w:rPr>
+                        <w:t>a</w:t>
+                      </w:r>
+                      <w:r>
+                        <w:rPr>
+                          <w:rFonts w:asciiTheme="majorHAnsi" w:hAnsiTheme="majorHAnsi" w:cstheme="majorHAnsi"/>
+                          <w:sz w:val="44"/>
+                          <w:szCs w:val="48"/>
+                        </w:rPr>
+                        <w:t>do Zepeda Gómez</w:t>
                       </w:r>
                       <w:r>
                         <w:rPr>
@@ -1835,7 +1871,58 @@
     <w:p>
       <w:r>
         <w:tab/>
-        <w:t xml:space="preserve">El entorno de desarrollo se compone de distintas vistas para manejar el proyecto de manera óptima. Por un lado, tenemos el Project Management el cual muestra las carpetas de recursos, clases, vistas y archivos de variables de entorno, se encuentra también </w:t>
+        <w:t xml:space="preserve">El entorno de desarrollo se compone de distintas vistas para manejar el proyecto de manera óptima. Por un lado, </w:t>
+      </w:r>
+      <w:r>
+        <w:t xml:space="preserve">nos deja configurar la versión de API con la que queremos que la mayoría de los dispositivos sea compatible, nos especifica el porcentaje de usuarios que poseen la API en sus dispositivos y nos da recomendaciones. </w:t>
+      </w:r>
+    </w:p>
+    <w:p>
+      <w:r>
+        <w:tab/>
+        <w:t xml:space="preserve">Después en el apartado de desarrollo tenemos distintas vistas que nos permiten interactuar con todas las configuraciones de nuestro proyecto. Cuenta con su propio </w:t>
+      </w:r>
+      <w:r>
+        <w:t>Project Management el cual muestra las carpetas de recursos, clases, vistas y archivos de variables de entorno</w:t>
+      </w:r>
+      <w:r>
+        <w:t>.</w:t>
+      </w:r>
+      <w:r>
+        <w:t xml:space="preserve"> Tenemos la ventana principal que carga los archivos para poder leer y escribir en ellos. Dentro de esta misma al seleccionar un archivo de vista, nosotros podremos intercambiar entre las distintas opciones de como trabajar, puesto que cuenta con un entorno de desarrollo grafico para las vistas. Y cuenta con su barra configuraciones, opciones de arranque y sin fin de formas para personalizar el entorno.</w:t>
+      </w:r>
+    </w:p>
+    <w:p/>
+    <w:p>
+      <w:r>
+        <w:tab/>
+        <w:t>Por último, cuenta con un apartado de emulador el cual puede emular cualquiera de los dispositivos Android de Google (modelos Pixie), que nos permitirá ejecutar las aplicaciones directas en un software de Android.</w:t>
+      </w:r>
+    </w:p>
+    <w:p>
+      <w:pPr>
+        <w:pStyle w:val="Ttulo2"/>
+      </w:pPr>
+      <w:r>
+        <w:t>Generalidades sobre Android Studio</w:t>
+      </w:r>
+    </w:p>
+    <w:p/>
+    <w:p>
+      <w:pPr>
+        <w:pStyle w:val="Ttulo2"/>
+      </w:pPr>
+      <w:r>
+        <w:lastRenderedPageBreak/>
+        <w:t>¿Cómo se realiza el diseño gráfico en Android Studio?</w:t>
+      </w:r>
+    </w:p>
+    <w:p>
+      <w:pPr>
+        <w:pStyle w:val="Ttulo2"/>
+      </w:pPr>
+      <w:r>
+        <w:t>¿Cómo es la jerarquía de los elementos en la pantalla de diseño (árbol de componentes)?</w:t>
       </w:r>
     </w:p>
     <w:p>
@@ -1856,41 +1943,6 @@
         <w:t>6</w:t>
       </w:r>
     </w:p>
-    <w:p/>
-    <w:p/>
-    <w:p>
-      <w:pPr>
-        <w:jc w:val="left"/>
-      </w:pPr>
-      <w:r>
-        <w:t xml:space="preserve">Nombre del archivo: </w:t>
-      </w:r>
-      <w:r>
-        <w:br/>
-      </w:r>
-      <w:proofErr w:type="spellStart"/>
-      <w:proofErr w:type="gramStart"/>
-      <w:r>
-        <w:t>QuijasContrerasVictorManuel</w:t>
-      </w:r>
-      <w:proofErr w:type="spellEnd"/>
-      <w:r>
-        <w:t>[</w:t>
-      </w:r>
-      <w:proofErr w:type="gramEnd"/>
-      <w:r>
-        <w:t>Fecha</w:t>
-      </w:r>
-      <w:proofErr w:type="gramStart"/>
-      <w:r>
-        <w:t>][</w:t>
-      </w:r>
-      <w:proofErr w:type="gramEnd"/>
-      <w:r>
-        <w:t>Tipo de actividad]#[número].</w:t>
-      </w:r>
-    </w:p>
-    <w:p/>
     <w:p/>
     <w:p/>
     <w:p/>
@@ -2113,20 +2165,8 @@
         <w:sz w:val="28"/>
         <w:szCs w:val="32"/>
       </w:rPr>
-      <w:t xml:space="preserve">Generalidades de Android </w:t>
+      <w:t>Generalidades de Android Studio</w:t>
     </w:r>
-    <w:proofErr w:type="spellStart"/>
-    <w:r>
-      <w:rPr>
-        <w:rFonts w:asciiTheme="majorHAnsi" w:hAnsiTheme="majorHAnsi" w:cstheme="majorHAnsi"/>
-        <w:b/>
-        <w:bCs/>
-        <w:sz w:val="28"/>
-        <w:szCs w:val="32"/>
-      </w:rPr>
-      <w:t>Studios</w:t>
-    </w:r>
-    <w:proofErr w:type="spellEnd"/>
   </w:p>
 </w:hdr>
 </file>

</xml_diff>

<commit_message>
lap -> PC: Interacción
</commit_message>
<xml_diff>
--- a/TAREAS 6 SEMESTRE/QuijasContrerasVictorManuel21082026TC#2.docx
+++ b/TAREAS 6 SEMESTRE/QuijasContrerasVictorManuel21082026TC#2.docx
@@ -1164,7 +1164,15 @@
                                 <w:sz w:val="44"/>
                                 <w:szCs w:val="48"/>
                               </w:rPr>
-                              <w:t>20</w:t>
+                              <w:t>2</w:t>
+                            </w:r>
+                            <w:r>
+                              <w:rPr>
+                                <w:rFonts w:asciiTheme="majorHAnsi" w:hAnsiTheme="majorHAnsi" w:cstheme="majorHAnsi"/>
+                                <w:sz w:val="44"/>
+                                <w:szCs w:val="48"/>
+                              </w:rPr>
+                              <w:t>1</w:t>
                             </w:r>
                             <w:r>
                               <w:rPr>
@@ -1386,7 +1394,15 @@
                           <w:sz w:val="44"/>
                           <w:szCs w:val="48"/>
                         </w:rPr>
-                        <w:t>20</w:t>
+                        <w:t>2</w:t>
+                      </w:r>
+                      <w:r>
+                        <w:rPr>
+                          <w:rFonts w:asciiTheme="majorHAnsi" w:hAnsiTheme="majorHAnsi" w:cstheme="majorHAnsi"/>
+                          <w:sz w:val="44"/>
+                          <w:szCs w:val="48"/>
+                        </w:rPr>
+                        <w:t>1</w:t>
                       </w:r>
                       <w:r>
                         <w:rPr>
@@ -1907,7 +1923,12 @@
         <w:t>Generalidades sobre Android Studio</w:t>
       </w:r>
     </w:p>
-    <w:p/>
+    <w:p>
+      <w:r>
+        <w:tab/>
+        <w:t>El entorno de desarrollo de Android es mayormente mixto, tanto para implementar código como de diseño gráfico, su estética es bastante moderna ya que utiliza el controlador de versiones de Git y abierta a integrar un mundo de plugins y configuraciones. Además, cuenta con una librería de dispositivos de prueba muy grande para comprobar la compatibilidad de las aplicaciones. Utiliza por defecto el modelo de capas de vista-controlador para programar.</w:t>
+      </w:r>
+    </w:p>
     <w:p>
       <w:pPr>
         <w:pStyle w:val="Ttulo2"/>

</xml_diff>